<commit_message>
Add AI Discovery & Agent Experience Services (AXP) page and explainer video
- New route /solutions/ai-discovery-agent-experience (hero, answer, workstreams + video,
  6-step HowTo, Scrunch + TEAM section linking other solution pages, why + labeled Scrunch
  customer results, answers, 12 FAQs, contact)
- Decisions: TEAM is a Scrunch reseller; CTA uses the service name; new service (no TEAM
  results claimed); Scrunch described as Sitecore's solution; managed GEO stays in stepper/FAQ
- JSON-LD: Service with isRelatedTo, Organization hasCredential, VideoObject
- All five solution pages are now live in navbar, footer and sitemap

Co-Authored-By: Claude Opus 5.5 <noreply@anthropic.com>
Claude-Session: https://claude.ai/code/session_013wwRamYmoaCu2Jj7xRXZqL
</commit_message>
<xml_diff>
--- a/docs/AI-Discovery-Agent-Experience-Strategy.docx
+++ b/docs/AI-Discovery-Agent-Experience-Strategy.docx
@@ -325,7 +325,7 @@
           <w:sz w:val="21"/>
           <w:szCs w:val="21"/>
         </w:rPr>
-        <w:t xml:space="preserve">Entry offer:</w:t>
+        <w:t xml:space="preserve">Commercial model:</w:t>
       </w:r>
       <w:r>
         <w:rPr>
@@ -334,7 +334,7 @@
           <w:sz w:val="21"/>
           <w:szCs w:val="21"/>
         </w:rPr>
-        <w:t xml:space="preserve"> an AI Discovery Assessment (name from the Scrunch - Services tab) with an AI visibility baseline, competitive share of voice and a prioritized GEO roadmap. No week count is published until confirmed.</w:t>
+        <w:t xml:space="preserve"> TEAM is a Scrunch reseller, so the page offers the Scrunch license and the services from one partner. The call to action uses the service name, AI Discovery &amp; Agent Experience Services (AXP), powered by Scrunch; engagements start with the assessment workstream (baseline, competitive share of voice, GEO roadmap). No week count is published.</w:t>
       </w:r>
     </w:p>
     <w:p>
@@ -1056,7 +1056,7 @@
           <w:sz w:val="21"/>
           <w:szCs w:val="21"/>
         </w:rPr>
-        <w:t xml:space="preserve">TEAM International provides generative engine optimization services and AEO services for mid-size and enterprise companies in North America and Europe, powered by the Scrunch AI visibility platform. We measure how ChatGPT, Gemini, Claude, Perplexity and Google AI Overviews describe your brand, fix the technical and content gaps that keep you out of AI answers, and deploy Scrunch's Agent Experience Platform so AI agents get optimized content while your website stays unchanged.</w:t>
+        <w:t xml:space="preserve">TEAM International provides generative engine optimization services and AEO services for mid-size and enterprise companies in North America and Europe, as a Scrunch reseller. We measure how ChatGPT, Gemini, Claude, Perplexity and Google AI Overviews describe your brand, fix the technical and content gaps that keep you out of AI answers, and deploy Scrunch's Agent Experience Platform so AI agents get optimized content while your website stays unchanged.</w:t>
       </w:r>
     </w:p>
     <w:p>
@@ -16920,7 +16920,7 @@
           <w:sz w:val="21"/>
           <w:szCs w:val="21"/>
         </w:rPr>
-        <w:t xml:space="preserve"> six answer snippets (two of them exact high-volume questions) and eleven FAQs.</w:t>
+        <w:t xml:space="preserve"> six answer snippets (two of them exact high-volume questions) and twelve FAQs.</w:t>
       </w:r>
     </w:p>
     <w:p>
@@ -17156,7 +17156,7 @@
           <w:sz w:val="21"/>
           <w:szCs w:val="21"/>
         </w:rPr>
-        <w:t xml:space="preserve">TEAM International provides generative engine optimization services and AEO services for mid-size and enterprise companies in North America and Europe, powered by the Scrunch AI visibility platform. We measure how ChatGPT, Gemini, Claude, Perplexity and Google AI Overviews describe your brand, fix the technical and content gaps that keep you out of AI answers, and deploy Scrunch's Agent Experience Platform so AI agents get optimized content while your website stays unchanged.</w:t>
+        <w:t xml:space="preserve">TEAM International provides generative engine optimization services and AEO services for mid-size and enterprise companies in North America and Europe, as a Scrunch reseller. We measure how ChatGPT, Gemini, Claude, Perplexity and Google AI Overviews describe your brand, fix the technical and content gaps that keep you out of AI answers, and deploy Scrunch's Agent Experience Platform so AI agents get optimized content while your website stays unchanged.</w:t>
       </w:r>
     </w:p>
     <w:p>
@@ -17460,7 +17460,7 @@
         <w:pStyle w:val="Heading2"/>
       </w:pPr>
       <w:r>
-        <w:t xml:space="preserve">FAQ (11 questions)</w:t>
+        <w:t xml:space="preserve">FAQ (12 questions)</w:t>
       </w:r>
     </w:p>
     <w:p>
@@ -17621,7 +17621,7 @@
           <w:sz w:val="22"/>
           <w:szCs w:val="22"/>
         </w:rPr>
-        <w:t xml:space="preserve">4. Will AXP change our website?</w:t>
+        <w:t xml:space="preserve">4. Do we need to buy Scrunch separately?</w:t>
       </w:r>
       <w:r>
         <w:rPr>
@@ -17632,7 +17632,7 @@
           <w:sz w:val="18"/>
           <w:szCs w:val="18"/>
         </w:rPr>
-        <w:t xml:space="preserve">   Targets: AXP objection (GEO)</w:t>
+        <w:t xml:space="preserve">   Targets: Scrunch reseller (GEO)</w:t>
       </w:r>
     </w:p>
     <w:p>
@@ -17652,7 +17652,7 @@
           <w:sz w:val="21"/>
           <w:szCs w:val="21"/>
         </w:rPr>
-        <w:t xml:space="preserve">No. AXP runs at the CDN edge and only changes what AI agents receive. Human visitors and traditional search crawlers such as Googlebot see your normal site. Content rules, approvals and redactions keep you in control of what agents get.</w:t>
+        <w:t xml:space="preserve">No. TEAM International is a Scrunch reseller, so you get the Scrunch license, setup, integration and optimization services from one partner, with one point of contact. If you already use Scrunch, we work in your existing account.</w:t>
       </w:r>
     </w:p>
     <w:p>
@@ -17669,7 +17669,7 @@
           <w:sz w:val="22"/>
           <w:szCs w:val="22"/>
         </w:rPr>
-        <w:t xml:space="preserve">5. Does GEO replace SEO?</w:t>
+        <w:t xml:space="preserve">5. Will AXP change our website?</w:t>
       </w:r>
       <w:r>
         <w:rPr>
@@ -17680,7 +17680,7 @@
           <w:sz w:val="18"/>
           <w:szCs w:val="18"/>
         </w:rPr>
-        <w:t xml:space="preserve">   Targets: llm seo, agentic seo</w:t>
+        <w:t xml:space="preserve">   Targets: AXP objection (GEO)</w:t>
       </w:r>
     </w:p>
     <w:p>
@@ -17700,7 +17700,7 @@
           <w:sz w:val="21"/>
           <w:szCs w:val="21"/>
         </w:rPr>
-        <w:t xml:space="preserve">No. GEO builds on SEO. LLM SEO, agentic SEO and AEO depend on the same foundations: crawlable, fast, well-structured pages and authoritative content. The difference is the goal: being cited and recommended inside AI answers, which requires new measurement and new content formats.</w:t>
+        <w:t xml:space="preserve">No. AXP runs at the CDN edge and only changes what AI agents receive. Human visitors and traditional search crawlers such as Googlebot see your normal site. Content rules, approvals and redactions keep you in control of what agents get.</w:t>
       </w:r>
     </w:p>
     <w:p>
@@ -17717,7 +17717,7 @@
           <w:sz w:val="22"/>
           <w:szCs w:val="22"/>
         </w:rPr>
-        <w:t xml:space="preserve">6. How do you measure the ROI of GEO?</w:t>
+        <w:t xml:space="preserve">6. Does GEO replace SEO?</w:t>
       </w:r>
       <w:r>
         <w:rPr>
@@ -17728,7 +17728,7 @@
           <w:sz w:val="18"/>
           <w:szCs w:val="18"/>
         </w:rPr>
-        <w:t xml:space="preserve">   Targets: ROI (GEO)</w:t>
+        <w:t xml:space="preserve">   Targets: llm seo, agentic seo</w:t>
       </w:r>
     </w:p>
     <w:p>
@@ -17748,7 +17748,7 @@
           <w:sz w:val="21"/>
           <w:szCs w:val="21"/>
         </w:rPr>
-        <w:t xml:space="preserve">We track leading indicators in Scrunch, such as AI share of voice, citations, brand presence on non-branded prompts and sentiment, and connect AI referral and agent traffic to your analytics and CRM, so leadership sees visits, leads and pipeline influenced by AI discovery.</w:t>
+        <w:t xml:space="preserve">No. GEO builds on SEO. LLM SEO, agentic SEO and AEO depend on the same foundations: crawlable, fast, well-structured pages and authoritative content. The difference is the goal: being cited and recommended inside AI answers, which requires new measurement and new content formats.</w:t>
       </w:r>
     </w:p>
     <w:p>
@@ -17765,7 +17765,7 @@
           <w:sz w:val="22"/>
           <w:szCs w:val="22"/>
         </w:rPr>
-        <w:t xml:space="preserve">7. Is GEO different for B2B companies?</w:t>
+        <w:t xml:space="preserve">7. How do you measure the ROI of GEO?</w:t>
       </w:r>
       <w:r>
         <w:rPr>
@@ -17776,7 +17776,7 @@
           <w:sz w:val="18"/>
           <w:szCs w:val="18"/>
         </w:rPr>
-        <w:t xml:space="preserve">   Targets: geo for b2b, generative engine optimization for b2b, aeo agency for b2b</w:t>
+        <w:t xml:space="preserve">   Targets: ROI (GEO)</w:t>
       </w:r>
     </w:p>
     <w:p>
@@ -17796,7 +17796,7 @@
           <w:sz w:val="21"/>
           <w:szCs w:val="21"/>
         </w:rPr>
-        <w:t xml:space="preserve">Yes. GEO for B2B targets long, research-heavy buying journeys with several stakeholders and technical questions. Generative engine optimization for B2B focuses on comparison, use-case and technical content, proof and third-party authority. As an AEO agency for B2B companies, we build the prompt universe around each buying stage and role.</w:t>
+        <w:t xml:space="preserve">We track leading indicators in Scrunch, such as AI share of voice, citations, brand presence on non-branded prompts and sentiment, and connect AI referral and agent traffic to your analytics and CRM, so leadership sees visits, leads and pipeline influenced by AI discovery.</w:t>
       </w:r>
     </w:p>
     <w:p>
@@ -17813,7 +17813,7 @@
           <w:sz w:val="22"/>
           <w:szCs w:val="22"/>
         </w:rPr>
-        <w:t xml:space="preserve">8. How soon can we see results?</w:t>
+        <w:t xml:space="preserve">8. Is GEO different for B2B companies?</w:t>
       </w:r>
       <w:r>
         <w:rPr>
@@ -17824,7 +17824,7 @@
           <w:sz w:val="18"/>
           <w:szCs w:val="18"/>
         </w:rPr>
-        <w:t xml:space="preserve">   Targets: timing (GEO)</w:t>
+        <w:t xml:space="preserve">   Targets: geo for b2b, generative engine optimization for b2b, aeo agency for b2b</w:t>
       </w:r>
     </w:p>
     <w:p>
@@ -17844,7 +17844,7 @@
           <w:sz w:val="21"/>
           <w:szCs w:val="21"/>
         </w:rPr>
-        <w:t xml:space="preserve">The baseline is available as soon as Scrunch is configured. Improvements depend on your starting point, content and how fast fixes ship; Scrunch customers such as Tinybird and Strapi have reported significant gains within three months. We review progress monthly.</w:t>
+        <w:t xml:space="preserve">Yes. GEO for B2B targets long, research-heavy buying journeys with several stakeholders and technical questions. Generative engine optimization for B2B focuses on comparison, use-case and technical content, proof and third-party authority. As an AEO agency for B2B companies, we build the prompt universe around each buying stage and role.</w:t>
       </w:r>
     </w:p>
     <w:p>
@@ -17861,7 +17861,7 @@
           <w:sz w:val="22"/>
           <w:szCs w:val="22"/>
         </w:rPr>
-        <w:t xml:space="preserve">9. What is the connection between Scrunch and Sitecore?</w:t>
+        <w:t xml:space="preserve">9. How soon can we see results?</w:t>
       </w:r>
       <w:r>
         <w:rPr>
@@ -17872,7 +17872,7 @@
           <w:sz w:val="18"/>
           <w:szCs w:val="18"/>
         </w:rPr>
-        <w:t xml:space="preserve">   Targets: Sitecore context (GEO)</w:t>
+        <w:t xml:space="preserve">   Targets: timing (GEO)</w:t>
       </w:r>
     </w:p>
     <w:p>
@@ -17892,7 +17892,7 @@
           <w:sz w:val="21"/>
           <w:szCs w:val="21"/>
         </w:rPr>
-        <w:t xml:space="preserve">Sitecore announced the acquisition of Scrunch in June 2026. Scrunch insights are being built into SitecoreAI content and marketing products, which makes AI visibility a natural starting point for content platform and digital experience improvements.</w:t>
+        <w:t xml:space="preserve">The baseline is available as soon as Scrunch is configured. Improvements depend on your starting point, content and how fast fixes ship; Scrunch customers such as Tinybird and Strapi have reported significant gains within three months. We review progress monthly.</w:t>
       </w:r>
     </w:p>
     <w:p>
@@ -17909,7 +17909,7 @@
           <w:sz w:val="22"/>
           <w:szCs w:val="22"/>
         </w:rPr>
-        <w:t xml:space="preserve">10. Do you work with mid-size companies?</w:t>
+        <w:t xml:space="preserve">10. What is the connection between Scrunch and Sitecore?</w:t>
       </w:r>
       <w:r>
         <w:rPr>
@@ -17920,7 +17920,7 @@
           <w:sz w:val="18"/>
           <w:szCs w:val="18"/>
         </w:rPr>
-        <w:t xml:space="preserve">   Targets: mid-size prompts (GEO)</w:t>
+        <w:t xml:space="preserve">   Targets: Sitecore context (GEO)</w:t>
       </w:r>
     </w:p>
     <w:p>
@@ -17940,7 +17940,7 @@
           <w:sz w:val="21"/>
           <w:szCs w:val="21"/>
         </w:rPr>
-        <w:t xml:space="preserve">Yes. Mid-size companies often gain AI share of voice faster than large competitors because they can publish and fix quickly. We scale the work to your priorities and staff it with senior people in your time zone.</w:t>
+        <w:t xml:space="preserve">Scrunch is Sitecore's AI visibility solution: Sitecore announced the acquisition in June 2026, and Scrunch insights are being built into SitecoreAI content and marketing products. That makes AI visibility a natural starting point for content platform and digital experience improvements.</w:t>
       </w:r>
     </w:p>
     <w:p>
@@ -17957,7 +17957,7 @@
           <w:sz w:val="22"/>
           <w:szCs w:val="22"/>
         </w:rPr>
-        <w:t xml:space="preserve">11. How do we start?</w:t>
+        <w:t xml:space="preserve">11. Do you work with mid-size companies?</w:t>
       </w:r>
       <w:r>
         <w:rPr>
@@ -17968,7 +17968,7 @@
           <w:sz w:val="18"/>
           <w:szCs w:val="18"/>
         </w:rPr>
-        <w:t xml:space="preserve">   Targets: brand + call to action</w:t>
+        <w:t xml:space="preserve">   Targets: mid-size prompts (GEO)</w:t>
       </w:r>
     </w:p>
     <w:p>
@@ -17988,7 +17988,55 @@
           <w:sz w:val="21"/>
           <w:szCs w:val="21"/>
         </w:rPr>
-        <w:t xml:space="preserve">Start with an AI Discovery Assessment. TEAM International maps your buyers' prompts, baselines your AI visibility and share of voice against competitors, reviews technical readiness and delivers a prioritized GEO roadmap with KPIs.</w:t>
+        <w:t xml:space="preserve">Yes. Mid-size companies often gain AI share of voice faster than large competitors because they can publish and fix quickly. We scale the work to your priorities and staff it with senior people in your time zone.</w:t>
+      </w:r>
+    </w:p>
+    <w:p>
+      <w:pPr>
+        <w:keepNext/>
+        <w:spacing w:after="60" w:before="160"/>
+      </w:pPr>
+      <w:r>
+        <w:rPr>
+          <w:rFonts w:ascii="Aptos" w:cs="Aptos" w:eastAsia="Aptos" w:hAnsi="Aptos"/>
+          <w:b/>
+          <w:bCs/>
+          <w:color w:val="2F282D"/>
+          <w:sz w:val="22"/>
+          <w:szCs w:val="22"/>
+        </w:rPr>
+        <w:t xml:space="preserve">12. How do we start?</w:t>
+      </w:r>
+      <w:r>
+        <w:rPr>
+          <w:rFonts w:ascii="Aptos" w:cs="Aptos" w:eastAsia="Aptos" w:hAnsi="Aptos"/>
+          <w:i/>
+          <w:iCs/>
+          <w:color w:val="756B72"/>
+          <w:sz w:val="18"/>
+          <w:szCs w:val="18"/>
+        </w:rPr>
+        <w:t xml:space="preserve">   Targets: brand + call to action</w:t>
+      </w:r>
+    </w:p>
+    <w:p>
+      <w:pPr>
+        <w:pBdr>
+          <w:left w:val="single" w:color="FDBE00" w:sz="18" w:space="10"/>
+        </w:pBdr>
+        <w:spacing w:after="200" w:before="80" w:line="288"/>
+        <w:ind w:left="360" w:right="240"/>
+      </w:pPr>
+      <w:r>
+        <w:rPr>
+          <w:rFonts w:ascii="Aptos" w:cs="Aptos" w:eastAsia="Aptos" w:hAnsi="Aptos"/>
+          <w:i w:val="false"/>
+          <w:iCs w:val="false"/>
+          <w:color w:val="2F282D"/>
+          <w:sz w:val="21"/>
+          <w:szCs w:val="21"/>
+        </w:rPr>
+        <w:t xml:space="preserve">Start with the first workstream: TEAM International maps your buyers' prompts, baselines your AI visibility and share of voice against competitors in Scrunch, reviews technical readiness and delivers a prioritized GEO roadmap with KPIs. From there you choose the workstreams that close the biggest gaps.</w:t>
       </w:r>
     </w:p>
     <w:p>
@@ -22346,6 +22394,134 @@
           <w:sz w:val="15"/>
           <w:szCs w:val="15"/>
         </w:rPr>
+        <w:t xml:space="preserve">      "name": "Do we need to buy Scrunch separately?",</w:t>
+      </w:r>
+    </w:p>
+    <w:p>
+      <w:pPr>
+        <w:shd w:fill="F4F1F3" w:color="auto" w:val="clear"/>
+        <w:spacing w:after="0" w:line="240"/>
+        <w:ind w:left="120" w:right="120"/>
+      </w:pPr>
+      <w:r>
+        <w:rPr>
+          <w:rFonts w:ascii="Consolas" w:cs="Consolas" w:eastAsia="Consolas" w:hAnsi="Consolas"/>
+          <w:color w:val="2F282D"/>
+          <w:sz w:val="15"/>
+          <w:szCs w:val="15"/>
+        </w:rPr>
+        <w:t xml:space="preserve">      "acceptedAnswer": {</w:t>
+      </w:r>
+    </w:p>
+    <w:p>
+      <w:pPr>
+        <w:shd w:fill="F4F1F3" w:color="auto" w:val="clear"/>
+        <w:spacing w:after="0" w:line="240"/>
+        <w:ind w:left="120" w:right="120"/>
+      </w:pPr>
+      <w:r>
+        <w:rPr>
+          <w:rFonts w:ascii="Consolas" w:cs="Consolas" w:eastAsia="Consolas" w:hAnsi="Consolas"/>
+          <w:color w:val="2F282D"/>
+          <w:sz w:val="15"/>
+          <w:szCs w:val="15"/>
+        </w:rPr>
+        <w:t xml:space="preserve">        "@type": "Answer",</w:t>
+      </w:r>
+    </w:p>
+    <w:p>
+      <w:pPr>
+        <w:shd w:fill="F4F1F3" w:color="auto" w:val="clear"/>
+        <w:spacing w:after="0" w:line="240"/>
+        <w:ind w:left="120" w:right="120"/>
+      </w:pPr>
+      <w:r>
+        <w:rPr>
+          <w:rFonts w:ascii="Consolas" w:cs="Consolas" w:eastAsia="Consolas" w:hAnsi="Consolas"/>
+          <w:color w:val="2F282D"/>
+          <w:sz w:val="15"/>
+          <w:szCs w:val="15"/>
+        </w:rPr>
+        <w:t xml:space="preserve">        "text": "No. TEAM International is a Scrunch reseller, so you get the Scrunch license, setup, integration and optimization services from one partner, with one point of contact. If you already use Scrunch, we work in your existing account."</w:t>
+      </w:r>
+    </w:p>
+    <w:p>
+      <w:pPr>
+        <w:shd w:fill="F4F1F3" w:color="auto" w:val="clear"/>
+        <w:spacing w:after="0" w:line="240"/>
+        <w:ind w:left="120" w:right="120"/>
+      </w:pPr>
+      <w:r>
+        <w:rPr>
+          <w:rFonts w:ascii="Consolas" w:cs="Consolas" w:eastAsia="Consolas" w:hAnsi="Consolas"/>
+          <w:color w:val="2F282D"/>
+          <w:sz w:val="15"/>
+          <w:szCs w:val="15"/>
+        </w:rPr>
+        <w:t xml:space="preserve">      }</w:t>
+      </w:r>
+    </w:p>
+    <w:p>
+      <w:pPr>
+        <w:shd w:fill="F4F1F3" w:color="auto" w:val="clear"/>
+        <w:spacing w:after="0" w:line="240"/>
+        <w:ind w:left="120" w:right="120"/>
+      </w:pPr>
+      <w:r>
+        <w:rPr>
+          <w:rFonts w:ascii="Consolas" w:cs="Consolas" w:eastAsia="Consolas" w:hAnsi="Consolas"/>
+          <w:color w:val="2F282D"/>
+          <w:sz w:val="15"/>
+          <w:szCs w:val="15"/>
+        </w:rPr>
+        <w:t xml:space="preserve">    },</w:t>
+      </w:r>
+    </w:p>
+    <w:p>
+      <w:pPr>
+        <w:shd w:fill="F4F1F3" w:color="auto" w:val="clear"/>
+        <w:spacing w:after="0" w:line="240"/>
+        <w:ind w:left="120" w:right="120"/>
+      </w:pPr>
+      <w:r>
+        <w:rPr>
+          <w:rFonts w:ascii="Consolas" w:cs="Consolas" w:eastAsia="Consolas" w:hAnsi="Consolas"/>
+          <w:color w:val="2F282D"/>
+          <w:sz w:val="15"/>
+          <w:szCs w:val="15"/>
+        </w:rPr>
+        <w:t xml:space="preserve">    {</w:t>
+      </w:r>
+    </w:p>
+    <w:p>
+      <w:pPr>
+        <w:shd w:fill="F4F1F3" w:color="auto" w:val="clear"/>
+        <w:spacing w:after="0" w:line="240"/>
+        <w:ind w:left="120" w:right="120"/>
+      </w:pPr>
+      <w:r>
+        <w:rPr>
+          <w:rFonts w:ascii="Consolas" w:cs="Consolas" w:eastAsia="Consolas" w:hAnsi="Consolas"/>
+          <w:color w:val="2F282D"/>
+          <w:sz w:val="15"/>
+          <w:szCs w:val="15"/>
+        </w:rPr>
+        <w:t xml:space="preserve">      "@type": "Question",</w:t>
+      </w:r>
+    </w:p>
+    <w:p>
+      <w:pPr>
+        <w:shd w:fill="F4F1F3" w:color="auto" w:val="clear"/>
+        <w:spacing w:after="0" w:line="240"/>
+        <w:ind w:left="120" w:right="120"/>
+      </w:pPr>
+      <w:r>
+        <w:rPr>
+          <w:rFonts w:ascii="Consolas" w:cs="Consolas" w:eastAsia="Consolas" w:hAnsi="Consolas"/>
+          <w:color w:val="2F282D"/>
+          <w:sz w:val="15"/>
+          <w:szCs w:val="15"/>
+        </w:rPr>
         <w:t xml:space="preserve">      "name": "Will AXP change our website?",</w:t>
       </w:r>
     </w:p>
@@ -23034,7 +23210,7 @@
           <w:sz w:val="15"/>
           <w:szCs w:val="15"/>
         </w:rPr>
-        <w:t xml:space="preserve">        "text": "Sitecore announced the acquisition of Scrunch in June 2026. Scrunch insights are being built into SitecoreAI content and marketing products, which makes AI visibility a natural starting point for content platform and digital experience improvements."</w:t>
+        <w:t xml:space="preserve">        "text": "Scrunch is Sitecore's AI visibility solution: Sitecore announced the acquisition in June 2026, and Scrunch insights are being built into SitecoreAI content and marketing products. That makes AI visibility a natural starting point for content platform and digital experience improvements."</w:t>
       </w:r>
     </w:p>
     <w:p>
@@ -23290,7 +23466,7 @@
           <w:sz w:val="15"/>
           <w:szCs w:val="15"/>
         </w:rPr>
-        <w:t xml:space="preserve">        "text": "Start with an AI Discovery Assessment. TEAM International maps your buyers' prompts, baselines your AI visibility and share of voice against competitors, reviews technical readiness and delivers a prioritized GEO roadmap with KPIs."</w:t>
+        <w:t xml:space="preserve">        "text": "Start with the first workstream: TEAM International maps your buyers' prompts, baselines your AI visibility and share of voice against competitors in Scrunch, reviews technical readiness and delivers a prioritized GEO roadmap with KPIs. From there you choose the workstreams that close the biggest gaps."</w:t>
       </w:r>
     </w:p>
     <w:p>
@@ -23657,7 +23833,7 @@
                 <w:sz w:val="18"/>
                 <w:szCs w:val="18"/>
               </w:rPr>
-              <w:t xml:space="preserve">Confirm TEAM's relationship with Scrunch (reseller, implementation partner, agency partner) and how to describe it publicly</w:t>
+              <w:t xml:space="preserve">Scrunch relationship: RESELLER (Raul, Oct 15). Page says "Scrunch reseller" and offers license + services</w:t>
             </w:r>
           </w:p>
         </w:tc>
@@ -23719,7 +23895,7 @@
                 <w:sz w:val="18"/>
                 <w:szCs w:val="18"/>
               </w:rPr>
-              <w:t xml:space="preserve">"Powered by Scrunch" needs a confirmed partnership; the page may name the partner tier</w:t>
+              <w:t xml:space="preserve">Add a partner tier or badge if Scrunch provides one</w:t>
             </w:r>
           </w:p>
         </w:tc>
@@ -23756,7 +23932,7 @@
                 <w:sz w:val="18"/>
                 <w:szCs w:val="18"/>
               </w:rPr>
-              <w:t xml:space="preserve">Confirm the entry-offer name ("AI Discovery Assessment") and its length; the page shows no week count</w:t>
+              <w:t xml:space="preserve">Call to action: uses the service name, "AI Discovery &amp; Agent Experience Services (AXP), powered by Scrunch" (Raul, Oct 15); no separate assessment name or week count</w:t>
             </w:r>
           </w:p>
         </w:tc>
@@ -23856,7 +24032,7 @@
                 <w:sz w:val="18"/>
                 <w:szCs w:val="18"/>
               </w:rPr>
-              <w:t xml:space="preserve">Confirm whether TEAM can show any client or internal results (for example, TEAM's own AI visibility baseline)</w:t>
+              <w:t xml:space="preserve">Proof: NEW SERVICE, no TEAM results yet (Raul, Oct 15). Proof stays as clearly labeled Scrunch customer results</w:t>
             </w:r>
           </w:p>
         </w:tc>
@@ -23918,7 +24094,7 @@
                 <w:sz w:val="18"/>
                 <w:szCs w:val="18"/>
               </w:rPr>
-              <w:t xml:space="preserve">Today the proof is Scrunch customer results, clearly labeled</w:t>
+              <w:t xml:space="preserve">Add TEAM's own Scrunch baseline and first client results when available</w:t>
             </w:r>
           </w:p>
         </w:tc>
@@ -23955,7 +24131,7 @@
                 <w:sz w:val="18"/>
                 <w:szCs w:val="18"/>
               </w:rPr>
-              <w:t xml:space="preserve">Confirm TEAM's Sitecore partnership status before mentioning Sitecore services</w:t>
+              <w:t xml:space="preserve">Sitecore: "Scrunch is Sitecore's solution" (Raul, Oct 15). Mentioned as context; no Sitecore partnership claim</w:t>
             </w:r>
           </w:p>
         </w:tc>
@@ -24019,7 +24195,7 @@
                 <w:sz w:val="18"/>
                 <w:szCs w:val="18"/>
               </w:rPr>
-              <w:t xml:space="preserve">The FAQ mentions Sitecore only as context</w:t>
+              <w:t xml:space="preserve"/>
             </w:r>
           </w:p>
         </w:tc>
@@ -24055,7 +24231,7 @@
                 <w:sz w:val="18"/>
                 <w:szCs w:val="18"/>
               </w:rPr>
-              <w:t xml:space="preserve">Decide whether to add a managed GEO/AEO (Operate) offer as a sixth workstream</w:t>
+              <w:t xml:space="preserve">Managed GEO/AEO: KEEP in the stepper and FAQ, not a sixth workstream (Raul, Oct 15)</w:t>
             </w:r>
           </w:p>
         </w:tc>
@@ -24117,7 +24293,7 @@
                 <w:sz w:val="18"/>
                 <w:szCs w:val="18"/>
               </w:rPr>
-              <w:t xml:space="preserve">Recurring revenue; currently in the stepper and FAQs</w:t>
+              <w:t xml:space="preserve"/>
             </w:r>
           </w:p>
         </w:tc>
@@ -24154,7 +24330,7 @@
                 <w:sz w:val="18"/>
                 <w:szCs w:val="18"/>
               </w:rPr>
-              <w:t xml:space="preserve">Build the page and the explainer video in team-solutions-site</w:t>
+              <w:t xml:space="preserve">Page and video: BUILT in team-solutions-site (/solutions/ai-discovery-agent-experience)</w:t>
             </w:r>
           </w:p>
         </w:tc>
@@ -24218,7 +24394,7 @@
                 <w:sz w:val="18"/>
                 <w:szCs w:val="18"/>
               </w:rPr>
-              <w:t xml:space="preserve">Next step after approval</w:t>
+              <w:t xml:space="preserve">Review on Vercel after git push</w:t>
             </w:r>
           </w:p>
         </w:tc>
@@ -24244,7 +24420,7 @@
         </w:numPr>
         <w:spacing w:after="80"/>
       </w:pPr>
-      <w:hyperlink w:history="1" r:id="rIdq5btrplakbnfwd6rwlndw">
+      <w:hyperlink w:history="1" r:id="rId0asrnespdffssmwvnpwte">
         <w:r>
           <w:rPr>
             <w:rFonts w:ascii="Aptos" w:cs="Aptos" w:eastAsia="Aptos" w:hAnsi="Aptos"/>
@@ -24266,7 +24442,7 @@
         </w:numPr>
         <w:spacing w:after="80"/>
       </w:pPr>
-      <w:hyperlink w:history="1" r:id="rIdyowkakq8o7euh-l792vka">
+      <w:hyperlink w:history="1" r:id="rId_-2r-1valrvey8pgjrbwu">
         <w:r>
           <w:rPr>
             <w:rFonts w:ascii="Aptos" w:cs="Aptos" w:eastAsia="Aptos" w:hAnsi="Aptos"/>
@@ -24288,7 +24464,7 @@
         </w:numPr>
         <w:spacing w:after="80"/>
       </w:pPr>
-      <w:hyperlink w:history="1" r:id="rId3k6qczdcz4wxvqk2mnow_">
+      <w:hyperlink w:history="1" r:id="rIdcerojvheojk2n82pmseqm">
         <w:r>
           <w:rPr>
             <w:rFonts w:ascii="Aptos" w:cs="Aptos" w:eastAsia="Aptos" w:hAnsi="Aptos"/>
@@ -24310,7 +24486,7 @@
         </w:numPr>
         <w:spacing w:after="80"/>
       </w:pPr>
-      <w:hyperlink w:history="1" r:id="rIdhm9gijhwqms_mffshties">
+      <w:hyperlink w:history="1" r:id="rId2f6tfr75puvhk_v6zgjvp">
         <w:r>
           <w:rPr>
             <w:rFonts w:ascii="Aptos" w:cs="Aptos" w:eastAsia="Aptos" w:hAnsi="Aptos"/>
@@ -24332,7 +24508,7 @@
         </w:numPr>
         <w:spacing w:after="80"/>
       </w:pPr>
-      <w:hyperlink w:history="1" r:id="rId5eouqhwfhk6-xm2uu4_ax">
+      <w:hyperlink w:history="1" r:id="rIdfd4jxzvxzspyn_5bozw5i">
         <w:r>
           <w:rPr>
             <w:rFonts w:ascii="Aptos" w:cs="Aptos" w:eastAsia="Aptos" w:hAnsi="Aptos"/>
@@ -24354,7 +24530,7 @@
         </w:numPr>
         <w:spacing w:after="80"/>
       </w:pPr>
-      <w:hyperlink w:history="1" r:id="rIdtfd7s2pwgw0mm9_ci02jr">
+      <w:hyperlink w:history="1" r:id="rId092wnreg3ovlcrjt_jsgm">
         <w:r>
           <w:rPr>
             <w:rFonts w:ascii="Aptos" w:cs="Aptos" w:eastAsia="Aptos" w:hAnsi="Aptos"/>
@@ -24376,7 +24552,7 @@
         </w:numPr>
         <w:spacing w:after="80"/>
       </w:pPr>
-      <w:hyperlink w:history="1" r:id="rIdbju9klewebbo7ngynklng">
+      <w:hyperlink w:history="1" r:id="rIdmsmkbdqq9axme8m66appc">
         <w:r>
           <w:rPr>
             <w:rFonts w:ascii="Aptos" w:cs="Aptos" w:eastAsia="Aptos" w:hAnsi="Aptos"/>
@@ -24398,7 +24574,7 @@
         </w:numPr>
         <w:spacing w:after="80"/>
       </w:pPr>
-      <w:hyperlink w:history="1" r:id="rIdq7eg041juame-_cmd_jpb">
+      <w:hyperlink w:history="1" r:id="rIdt98t4aios-jpge96c8zhj">
         <w:r>
           <w:rPr>
             <w:rFonts w:ascii="Aptos" w:cs="Aptos" w:eastAsia="Aptos" w:hAnsi="Aptos"/>

</xml_diff>